<commit_message>
feat: bugfix artigo 28 maio
</commit_message>
<xml_diff>
--- a/extras/Artigo/0 construcao/0 escrita/v5 28 maio 2026/artigo _ Lucas _ FIES.docx
+++ b/extras/Artigo/0 construcao/0 escrita/v5 28 maio 2026/artigo _ Lucas _ FIES.docx
@@ -41,7 +41,7 @@
           <w:pgNumType w:start="1"/>
         </w:sectPr>
       </w:pPr>
-      <w:bookmarkStart w:colFirst="0" w:colLast="0" w:name="_38vqx2ha5h28" w:id="0"/>
+      <w:bookmarkStart w:colFirst="0" w:colLast="0" w:name="_mj02dsqza7h4" w:id="0"/>
       <w:bookmarkEnd w:id="0"/>
       <w:r>
         <w:rPr>
@@ -392,7 +392,7 @@
           <w:pgNumType w:start="1"/>
         </w:sectPr>
       </w:pPr>
-      <w:bookmarkStart w:colFirst="0" w:colLast="0" w:name="_9yvengidvmk0" w:id="3"/>
+      <w:bookmarkStart w:colFirst="0" w:colLast="0" w:name="_a8f0chxenzk7" w:id="3"/>
       <w:bookmarkEnd w:id="3"/>
       <w:r>
         <w:rPr>
@@ -604,7 +604,7 @@
           <w:pgNumType w:start="1"/>
         </w:sectPr>
       </w:pPr>
-      <w:bookmarkStart w:colFirst="0" w:colLast="0" w:name="_uq0r4ng1hb8z" w:id="4"/>
+      <w:bookmarkStart w:colFirst="0" w:colLast="0" w:name="_7djf67jodsjz" w:id="4"/>
       <w:bookmarkEnd w:id="4"/>
       <w:r>
         <w:rPr>
@@ -857,7 +857,7 @@
           <w:pgNumType w:start="1"/>
         </w:sectPr>
       </w:pPr>
-      <w:bookmarkStart w:colFirst="0" w:colLast="0" w:name="_bms8nqgvuqr2" w:id="5"/>
+      <w:bookmarkStart w:colFirst="0" w:colLast="0" w:name="_ypfco4ag5y2t" w:id="5"/>
       <w:bookmarkEnd w:id="5"/>
       <w:r>
         <w:rPr>
@@ -1060,7 +1060,7 @@
           <w:szCs w:val="24"/>
           <w:rtl w:val="0"/>
         </w:rPr>
-        <w:t xml:space="preserve">A quarta etapa examinou a passagem entre classificação acadêmica e contratação. Para isso, foram consideradas duas formas de observar o desfecho. A primeira distingue três situações do fluxo seletivo: lista de espera, não contratação e contratação efetiva. Essa forma permite observar, ao mesmo tempo, a barreira acadêmica inicial e a etapa contratual. A segunda restringe a comparação às inscrições não contratadas e contratadas, com o objetivo de observar mais diretamente a etapa de formalização do financiamento. Os resultados principais são apresentados por meio de probabilidades previstas, pois esse formato permite interpretar de maneira mais direta como renda e desempenho se associam às diferentes situações do processo seletivo.</w:t>
+        <w:t xml:space="preserve">A quarta etapa examinou a passagem entre classificação acadêmica e contratação. Para isso, foram consideradas duas formas de observar o desfecho. A primeira distingue três situações do fluxo seletivo: lista de espera, não contratação e contratação efetiva. Essa forma permite observar, ao mesmo tempo, a barreira acadêmica inicial e a etapa contratual. A segunda restringe à comparação às inscrições não contratadas e contratadas, com o objetivo de observar mais diretamente a etapa de formalização do financiamento. Os resultados principais são apresentados por meio de probabilidades previstas, pois esse formato permite interpretar de maneira mais direta como renda e desempenho se associam às diferentes situações do processo seletivo.</w:t>
       </w:r>
     </w:p>
     <w:p>
@@ -1175,7 +1175,7 @@
           <w:pgNumType w:start="1"/>
         </w:sectPr>
       </w:pPr>
-      <w:bookmarkStart w:colFirst="0" w:colLast="0" w:name="_uvezvacfl30g" w:id="6"/>
+      <w:bookmarkStart w:colFirst="0" w:colLast="0" w:name="_di5n4l712sgh" w:id="6"/>
       <w:bookmarkEnd w:id="6"/>
       <w:r>
         <w:rPr>
@@ -1494,12 +1494,12 @@
           <wp:inline distB="114300" distT="114300" distL="114300" distR="114300">
             <wp:extent cx="5600142" cy="6796199"/>
             <wp:effectExtent b="0" l="0" r="0" t="0"/>
-            <wp:docPr id="22" name="image20.png"/>
+            <wp:docPr id="1" name="image16.png"/>
             <a:graphic>
               <a:graphicData uri="http://schemas.openxmlformats.org/drawingml/2006/picture">
                 <pic:pic>
                   <pic:nvPicPr>
-                    <pic:cNvPr id="0" name="image20.png"/>
+                    <pic:cNvPr id="0" name="image16.png"/>
                     <pic:cNvPicPr preferRelativeResize="0"/>
                   </pic:nvPicPr>
                   <pic:blipFill>
@@ -1643,12 +1643,12 @@
           <wp:inline distB="114300" distT="114300" distL="114300" distR="114300">
             <wp:extent cx="5753475" cy="3492500"/>
             <wp:effectExtent b="0" l="0" r="0" t="0"/>
-            <wp:docPr id="16" name="image4.png"/>
+            <wp:docPr id="18" name="image8.png"/>
             <a:graphic>
               <a:graphicData uri="http://schemas.openxmlformats.org/drawingml/2006/picture">
                 <pic:pic>
                   <pic:nvPicPr>
-                    <pic:cNvPr id="0" name="image4.png"/>
+                    <pic:cNvPr id="0" name="image8.png"/>
                     <pic:cNvPicPr preferRelativeResize="0"/>
                   </pic:nvPicPr>
                   <pic:blipFill>
@@ -2008,12 +2008,12 @@
           <wp:inline distB="114300" distT="114300" distL="114300" distR="114300">
             <wp:extent cx="5753475" cy="3416300"/>
             <wp:effectExtent b="0" l="0" r="0" t="0"/>
-            <wp:docPr id="19" name="image18.png"/>
+            <wp:docPr id="15" name="image23.png"/>
             <a:graphic>
               <a:graphicData uri="http://schemas.openxmlformats.org/drawingml/2006/picture">
                 <pic:pic>
                   <pic:nvPicPr>
-                    <pic:cNvPr id="0" name="image18.png"/>
+                    <pic:cNvPr id="0" name="image23.png"/>
                     <pic:cNvPicPr preferRelativeResize="0"/>
                   </pic:nvPicPr>
                   <pic:blipFill>
@@ -2161,12 +2161,12 @@
           <wp:inline distB="114300" distT="114300" distL="114300" distR="114300">
             <wp:extent cx="5753475" cy="2184400"/>
             <wp:effectExtent b="0" l="0" r="0" t="0"/>
-            <wp:docPr id="15" name="image24.png"/>
+            <wp:docPr id="6" name="image2.png"/>
             <a:graphic>
               <a:graphicData uri="http://schemas.openxmlformats.org/drawingml/2006/picture">
                 <pic:pic>
                   <pic:nvPicPr>
-                    <pic:cNvPr id="0" name="image24.png"/>
+                    <pic:cNvPr id="0" name="image2.png"/>
                     <pic:cNvPicPr preferRelativeResize="0"/>
                   </pic:nvPicPr>
                   <pic:blipFill>
@@ -2361,12 +2361,12 @@
           <wp:inline distB="114300" distT="114300" distL="114300" distR="114300">
             <wp:extent cx="4058738" cy="2509532"/>
             <wp:effectExtent b="0" l="0" r="0" t="0"/>
-            <wp:docPr id="11" name="image11.png"/>
+            <wp:docPr id="22" name="image24.png"/>
             <a:graphic>
               <a:graphicData uri="http://schemas.openxmlformats.org/drawingml/2006/picture">
                 <pic:pic>
                   <pic:nvPicPr>
-                    <pic:cNvPr id="0" name="image11.png"/>
+                    <pic:cNvPr id="0" name="image24.png"/>
                     <pic:cNvPicPr preferRelativeResize="0"/>
                   </pic:nvPicPr>
                   <pic:blipFill>
@@ -2538,12 +2538,12 @@
           <wp:inline distB="114300" distT="114300" distL="114300" distR="114300">
             <wp:extent cx="5753475" cy="2006600"/>
             <wp:effectExtent b="0" l="0" r="0" t="0"/>
-            <wp:docPr id="17" name="image1.png"/>
+            <wp:docPr id="17" name="image9.png"/>
             <a:graphic>
               <a:graphicData uri="http://schemas.openxmlformats.org/drawingml/2006/picture">
                 <pic:pic>
                   <pic:nvPicPr>
-                    <pic:cNvPr id="0" name="image1.png"/>
+                    <pic:cNvPr id="0" name="image9.png"/>
                     <pic:cNvPicPr preferRelativeResize="0"/>
                   </pic:nvPicPr>
                   <pic:blipFill>
@@ -2700,12 +2700,12 @@
           <wp:inline distB="114300" distT="114300" distL="114300" distR="114300">
             <wp:extent cx="4554038" cy="3635734"/>
             <wp:effectExtent b="0" l="0" r="0" t="0"/>
-            <wp:docPr id="12" name="image25.png"/>
+            <wp:docPr id="7" name="image13.png"/>
             <a:graphic>
               <a:graphicData uri="http://schemas.openxmlformats.org/drawingml/2006/picture">
                 <pic:pic>
                   <pic:nvPicPr>
-                    <pic:cNvPr id="0" name="image25.png"/>
+                    <pic:cNvPr id="0" name="image13.png"/>
                     <pic:cNvPicPr preferRelativeResize="0"/>
                   </pic:nvPicPr>
                   <pic:blipFill>
@@ -2837,12 +2837,12 @@
           <wp:inline distB="114300" distT="114300" distL="114300" distR="114300">
             <wp:extent cx="5753475" cy="4584700"/>
             <wp:effectExtent b="0" l="0" r="0" t="0"/>
-            <wp:docPr id="20" name="image7.png"/>
+            <wp:docPr id="25" name="image25.png"/>
             <a:graphic>
               <a:graphicData uri="http://schemas.openxmlformats.org/drawingml/2006/picture">
                 <pic:pic>
                   <pic:nvPicPr>
-                    <pic:cNvPr id="0" name="image7.png"/>
+                    <pic:cNvPr id="0" name="image25.png"/>
                     <pic:cNvPicPr preferRelativeResize="0"/>
                   </pic:nvPicPr>
                   <pic:blipFill>
@@ -3109,12 +3109,12 @@
           <wp:inline distB="114300" distT="114300" distL="114300" distR="114300">
             <wp:extent cx="5753475" cy="2133600"/>
             <wp:effectExtent b="0" l="0" r="0" t="0"/>
-            <wp:docPr id="14" name="image2.png"/>
+            <wp:docPr id="23" name="image22.png"/>
             <a:graphic>
               <a:graphicData uri="http://schemas.openxmlformats.org/drawingml/2006/picture">
                 <pic:pic>
                   <pic:nvPicPr>
-                    <pic:cNvPr id="0" name="image2.png"/>
+                    <pic:cNvPr id="0" name="image22.png"/>
                     <pic:cNvPicPr preferRelativeResize="0"/>
                   </pic:nvPicPr>
                   <pic:blipFill>
@@ -3207,12 +3207,12 @@
           <wp:inline distB="114300" distT="114300" distL="114300" distR="114300">
             <wp:extent cx="5753475" cy="2133600"/>
             <wp:effectExtent b="0" l="0" r="0" t="0"/>
-            <wp:docPr id="8" name="image21.png"/>
+            <wp:docPr id="2" name="image3.png"/>
             <a:graphic>
               <a:graphicData uri="http://schemas.openxmlformats.org/drawingml/2006/picture">
                 <pic:pic>
                   <pic:nvPicPr>
-                    <pic:cNvPr id="0" name="image21.png"/>
+                    <pic:cNvPr id="0" name="image3.png"/>
                     <pic:cNvPicPr preferRelativeResize="0"/>
                   </pic:nvPicPr>
                   <pic:blipFill>
@@ -3299,7 +3299,7 @@
           <w:pgNumType w:start="1"/>
         </w:sectPr>
       </w:pPr>
-      <w:bookmarkStart w:colFirst="0" w:colLast="0" w:name="_lcgee9gk3xbw" w:id="11"/>
+      <w:bookmarkStart w:colFirst="0" w:colLast="0" w:name="_b58qud24lry3" w:id="11"/>
       <w:bookmarkEnd w:id="11"/>
       <w:r>
         <w:rPr>
@@ -3581,7 +3581,7 @@
           <w:pgNumType w:start="1"/>
         </w:sectPr>
       </w:pPr>
-      <w:bookmarkStart w:colFirst="0" w:colLast="0" w:name="_gbj52it8kewb" w:id="13"/>
+      <w:bookmarkStart w:colFirst="0" w:colLast="0" w:name="_agh6niiqixlf" w:id="13"/>
       <w:bookmarkEnd w:id="13"/>
       <w:r>
         <w:rPr>
@@ -4237,7 +4237,7 @@
           <w:pgNumType w:start="1"/>
         </w:sectPr>
       </w:pPr>
-      <w:bookmarkStart w:colFirst="0" w:colLast="0" w:name="_bzndig55t49i" w:id="14"/>
+      <w:bookmarkStart w:colFirst="0" w:colLast="0" w:name="_l3x59y4pj9ur" w:id="14"/>
       <w:bookmarkEnd w:id="14"/>
       <w:r>
         <w:rPr>
@@ -4324,12 +4324,12 @@
           <wp:inline distB="114300" distT="114300" distL="114300" distR="114300">
             <wp:extent cx="5364067" cy="6504756"/>
             <wp:effectExtent b="0" l="0" r="0" t="0"/>
-            <wp:docPr id="4" name="image14.png"/>
+            <wp:docPr id="24" name="image20.png"/>
             <a:graphic>
               <a:graphicData uri="http://schemas.openxmlformats.org/drawingml/2006/picture">
                 <pic:pic>
                   <pic:nvPicPr>
-                    <pic:cNvPr id="0" name="image14.png"/>
+                    <pic:cNvPr id="0" name="image20.png"/>
                     <pic:cNvPicPr preferRelativeResize="0"/>
                   </pic:nvPicPr>
                   <pic:blipFill>
@@ -4421,12 +4421,12 @@
           <wp:inline distB="114300" distT="114300" distL="114300" distR="114300">
             <wp:extent cx="5753475" cy="3492500"/>
             <wp:effectExtent b="0" l="0" r="0" t="0"/>
-            <wp:docPr id="23" name="image19.png"/>
+            <wp:docPr id="19" name="image15.png"/>
             <a:graphic>
               <a:graphicData uri="http://schemas.openxmlformats.org/drawingml/2006/picture">
                 <pic:pic>
                   <pic:nvPicPr>
-                    <pic:cNvPr id="0" name="image19.png"/>
+                    <pic:cNvPr id="0" name="image15.png"/>
                     <pic:cNvPicPr preferRelativeResize="0"/>
                   </pic:nvPicPr>
                   <pic:blipFill>
@@ -4649,12 +4649,12 @@
           <wp:inline distB="114300" distT="114300" distL="114300" distR="114300">
             <wp:extent cx="5753475" cy="6146800"/>
             <wp:effectExtent b="0" l="0" r="0" t="0"/>
-            <wp:docPr id="21" name="image23.png"/>
+            <wp:docPr id="12" name="image18.png"/>
             <a:graphic>
               <a:graphicData uri="http://schemas.openxmlformats.org/drawingml/2006/picture">
                 <pic:pic>
                   <pic:nvPicPr>
-                    <pic:cNvPr id="0" name="image23.png"/>
+                    <pic:cNvPr id="0" name="image18.png"/>
                     <pic:cNvPicPr preferRelativeResize="0"/>
                   </pic:nvPicPr>
                   <pic:blipFill>
@@ -4813,12 +4813,12 @@
           <wp:inline distB="114300" distT="114300" distL="114300" distR="114300">
             <wp:extent cx="5753475" cy="2438400"/>
             <wp:effectExtent b="0" l="0" r="0" t="0"/>
-            <wp:docPr id="18" name="image3.png"/>
+            <wp:docPr id="14" name="image7.png"/>
             <a:graphic>
               <a:graphicData uri="http://schemas.openxmlformats.org/drawingml/2006/picture">
                 <pic:pic>
                   <pic:nvPicPr>
-                    <pic:cNvPr id="0" name="image3.png"/>
+                    <pic:cNvPr id="0" name="image7.png"/>
                     <pic:cNvPicPr preferRelativeResize="0"/>
                   </pic:nvPicPr>
                   <pic:blipFill>
@@ -5101,12 +5101,12 @@
           <wp:inline distB="114300" distT="114300" distL="114300" distR="114300">
             <wp:extent cx="5753475" cy="4229100"/>
             <wp:effectExtent b="0" l="0" r="0" t="0"/>
-            <wp:docPr id="3" name="image5.png"/>
+            <wp:docPr id="5" name="image6.png"/>
             <a:graphic>
               <a:graphicData uri="http://schemas.openxmlformats.org/drawingml/2006/picture">
                 <pic:pic>
                   <pic:nvPicPr>
-                    <pic:cNvPr id="0" name="image5.png"/>
+                    <pic:cNvPr id="0" name="image6.png"/>
                     <pic:cNvPicPr preferRelativeResize="0"/>
                   </pic:nvPicPr>
                   <pic:blipFill>
@@ -5357,12 +5357,12 @@
           <wp:inline distB="114300" distT="114300" distL="114300" distR="114300">
             <wp:extent cx="5753475" cy="4991100"/>
             <wp:effectExtent b="0" l="0" r="0" t="0"/>
-            <wp:docPr id="5" name="image9.png"/>
+            <wp:docPr id="3" name="image19.png"/>
             <a:graphic>
               <a:graphicData uri="http://schemas.openxmlformats.org/drawingml/2006/picture">
                 <pic:pic>
                   <pic:nvPicPr>
-                    <pic:cNvPr id="0" name="image9.png"/>
+                    <pic:cNvPr id="0" name="image19.png"/>
                     <pic:cNvPicPr preferRelativeResize="0"/>
                   </pic:nvPicPr>
                   <pic:blipFill>
@@ -5489,12 +5489,12 @@
           <wp:inline distB="114300" distT="114300" distL="114300" distR="114300">
             <wp:extent cx="5753475" cy="1574800"/>
             <wp:effectExtent b="0" l="0" r="0" t="0"/>
-            <wp:docPr id="7" name="image6.png"/>
+            <wp:docPr id="21" name="image21.png"/>
             <a:graphic>
               <a:graphicData uri="http://schemas.openxmlformats.org/drawingml/2006/picture">
                 <pic:pic>
                   <pic:nvPicPr>
-                    <pic:cNvPr id="0" name="image6.png"/>
+                    <pic:cNvPr id="0" name="image21.png"/>
                     <pic:cNvPicPr preferRelativeResize="0"/>
                   </pic:nvPicPr>
                   <pic:blipFill>
@@ -5808,12 +5808,12 @@
           <wp:inline distB="114300" distT="114300" distL="114300" distR="114300">
             <wp:extent cx="5753475" cy="1346200"/>
             <wp:effectExtent b="0" l="0" r="0" t="0"/>
-            <wp:docPr id="10" name="image22.png"/>
+            <wp:docPr id="9" name="image4.png"/>
             <a:graphic>
               <a:graphicData uri="http://schemas.openxmlformats.org/drawingml/2006/picture">
                 <pic:pic>
                   <pic:nvPicPr>
-                    <pic:cNvPr id="0" name="image22.png"/>
+                    <pic:cNvPr id="0" name="image4.png"/>
                     <pic:cNvPicPr preferRelativeResize="0"/>
                   </pic:nvPicPr>
                   <pic:blipFill>
@@ -6144,12 +6144,12 @@
           <wp:inline distB="114300" distT="114300" distL="114300" distR="114300">
             <wp:extent cx="5753475" cy="1346200"/>
             <wp:effectExtent b="0" l="0" r="0" t="0"/>
-            <wp:docPr id="24" name="image17.png"/>
+            <wp:docPr id="10" name="image1.png"/>
             <a:graphic>
               <a:graphicData uri="http://schemas.openxmlformats.org/drawingml/2006/picture">
                 <pic:pic>
                   <pic:nvPicPr>
-                    <pic:cNvPr id="0" name="image17.png"/>
+                    <pic:cNvPr id="0" name="image1.png"/>
                     <pic:cNvPicPr preferRelativeResize="0"/>
                   </pic:nvPicPr>
                   <pic:blipFill>
@@ -6463,12 +6463,12 @@
           <wp:inline distB="114300" distT="114300" distL="114300" distR="114300">
             <wp:extent cx="5753475" cy="3810000"/>
             <wp:effectExtent b="0" l="0" r="0" t="0"/>
-            <wp:docPr id="2" name="image8.png"/>
+            <wp:docPr id="8" name="image10.png"/>
             <a:graphic>
               <a:graphicData uri="http://schemas.openxmlformats.org/drawingml/2006/picture">
                 <pic:pic>
                   <pic:nvPicPr>
-                    <pic:cNvPr id="0" name="image8.png"/>
+                    <pic:cNvPr id="0" name="image10.png"/>
                     <pic:cNvPicPr preferRelativeResize="0"/>
                   </pic:nvPicPr>
                   <pic:blipFill>
@@ -6680,12 +6680,12 @@
           <wp:inline distB="114300" distT="114300" distL="114300" distR="114300">
             <wp:extent cx="5753475" cy="3810000"/>
             <wp:effectExtent b="0" l="0" r="0" t="0"/>
-            <wp:docPr id="6" name="image10.png"/>
+            <wp:docPr id="16" name="image12.png"/>
             <a:graphic>
               <a:graphicData uri="http://schemas.openxmlformats.org/drawingml/2006/picture">
                 <pic:pic>
                   <pic:nvPicPr>
-                    <pic:cNvPr id="0" name="image10.png"/>
+                    <pic:cNvPr id="0" name="image12.png"/>
                     <pic:cNvPicPr preferRelativeResize="0"/>
                   </pic:nvPicPr>
                   <pic:blipFill>
@@ -6918,12 +6918,12 @@
           <wp:inline distB="114300" distT="114300" distL="114300" distR="114300">
             <wp:extent cx="5753475" cy="4991100"/>
             <wp:effectExtent b="0" l="0" r="0" t="0"/>
-            <wp:docPr id="1" name="image15.png"/>
+            <wp:docPr id="13" name="image17.png"/>
             <a:graphic>
               <a:graphicData uri="http://schemas.openxmlformats.org/drawingml/2006/picture">
                 <pic:pic>
                   <pic:nvPicPr>
-                    <pic:cNvPr id="0" name="image15.png"/>
+                    <pic:cNvPr id="0" name="image17.png"/>
                     <pic:cNvPicPr preferRelativeResize="0"/>
                   </pic:nvPicPr>
                   <pic:blipFill>
@@ -7084,12 +7084,12 @@
           <wp:inline distB="114300" distT="114300" distL="114300" distR="114300">
             <wp:extent cx="5753475" cy="1574800"/>
             <wp:effectExtent b="0" l="0" r="0" t="0"/>
-            <wp:docPr id="25" name="image16.png"/>
+            <wp:docPr id="11" name="image11.png"/>
             <a:graphic>
               <a:graphicData uri="http://schemas.openxmlformats.org/drawingml/2006/picture">
                 <pic:pic>
                   <pic:nvPicPr>
-                    <pic:cNvPr id="0" name="image16.png"/>
+                    <pic:cNvPr id="0" name="image11.png"/>
                     <pic:cNvPicPr preferRelativeResize="0"/>
                   </pic:nvPicPr>
                   <pic:blipFill>
@@ -7403,12 +7403,12 @@
           <wp:inline distB="114300" distT="114300" distL="114300" distR="114300">
             <wp:extent cx="5753475" cy="1346200"/>
             <wp:effectExtent b="0" l="0" r="0" t="0"/>
-            <wp:docPr id="9" name="image12.png"/>
+            <wp:docPr id="4" name="image5.png"/>
             <a:graphic>
               <a:graphicData uri="http://schemas.openxmlformats.org/drawingml/2006/picture">
                 <pic:pic>
                   <pic:nvPicPr>
-                    <pic:cNvPr id="0" name="image12.png"/>
+                    <pic:cNvPr id="0" name="image5.png"/>
                     <pic:cNvPicPr preferRelativeResize="0"/>
                   </pic:nvPicPr>
                   <pic:blipFill>
@@ -7739,12 +7739,12 @@
           <wp:inline distB="114300" distT="114300" distL="114300" distR="114300">
             <wp:extent cx="5753475" cy="3810000"/>
             <wp:effectExtent b="0" l="0" r="0" t="0"/>
-            <wp:docPr id="13" name="image13.png"/>
+            <wp:docPr id="20" name="image14.png"/>
             <a:graphic>
               <a:graphicData uri="http://schemas.openxmlformats.org/drawingml/2006/picture">
                 <pic:pic>
                   <pic:nvPicPr>
-                    <pic:cNvPr id="0" name="image13.png"/>
+                    <pic:cNvPr id="0" name="image14.png"/>
                     <pic:cNvPicPr preferRelativeResize="0"/>
                   </pic:nvPicPr>
                   <pic:blipFill>
@@ -7848,7 +7848,7 @@
           <w:pgNumType w:start="1"/>
         </w:sectPr>
       </w:pPr>
-      <w:bookmarkStart w:colFirst="0" w:colLast="0" w:name="_u8518o3amn3f" w:id="15"/>
+      <w:bookmarkStart w:colFirst="0" w:colLast="0" w:name="_wfqg2exflxrc" w:id="15"/>
       <w:bookmarkEnd w:id="15"/>
       <w:r>
         <w:rPr>
@@ -7908,6 +7908,12 @@
           <w:sz w:val="24"/>
           <w:szCs w:val="24"/>
         </w:rPr>
+        <w:sectPr>
+          <w:type w:val="nextPage"/>
+          <w:pgSz w:h="16834" w:w="11909" w:orient="portrait"/>
+          <w:pgMar w:bottom="1440" w:top="1440" w:left="1440" w:right="1440" w:header="720" w:footer="720"/>
+          <w:pgNumType w:start="1"/>
+        </w:sectPr>
       </w:pPr>
       <w:r>
         <w:rPr>
@@ -7952,6 +7958,310 @@
         <w:t xml:space="preserve">. Os dados brutos não são redistribuídos no repositório e devem ser baixados diretamente das fontes oficiais.</w:t>
       </w:r>
     </w:p>
+    <w:p>
+      <w:pPr>
+        <w:pStyle w:val="Title"/>
+        <w:keepNext w:val="0"/>
+        <w:keepLines w:val="0"/>
+        <w:pageBreakBefore w:val="0"/>
+        <w:widowControl w:val="0"/>
+        <w:pBdr>
+          <w:top w:space="0" w:sz="0" w:val="nil"/>
+          <w:left w:space="0" w:sz="0" w:val="nil"/>
+          <w:bottom w:space="0" w:sz="0" w:val="nil"/>
+          <w:right w:space="0" w:sz="0" w:val="nil"/>
+          <w:between w:space="0" w:sz="0" w:val="nil"/>
+        </w:pBdr>
+        <w:shd w:fill="auto" w:val="clear"/>
+        <w:spacing w:after="0" w:before="0" w:line="276" w:lineRule="auto"/>
+        <w:ind w:left="0" w:right="0" w:firstLine="0"/>
+        <w:jc w:val="left"/>
+        <w:rPr>
+          <w:rFonts w:ascii="Times New Roman" w:cs="Times New Roman" w:eastAsia="Times New Roman" w:hAnsi="Times New Roman"/>
+          <w:sz w:val="24"/>
+          <w:szCs w:val="24"/>
+        </w:rPr>
+        <w:sectPr>
+          <w:type w:val="nextPage"/>
+          <w:pgSz w:h="16834" w:w="11909" w:orient="portrait"/>
+          <w:pgMar w:bottom="1440" w:top="1440" w:left="1440" w:right="1440" w:header="720" w:footer="720"/>
+          <w:pgNumType w:start="1"/>
+        </w:sectPr>
+      </w:pPr>
+      <w:bookmarkStart w:colFirst="0" w:colLast="0" w:name="_h7xt4mhvmet1" w:id="16"/>
+      <w:bookmarkEnd w:id="16"/>
+      <w:r>
+        <w:rPr>
+          <w:rFonts w:ascii="Arial" w:cs="Arial" w:eastAsia="Arial" w:hAnsi="Arial"/>
+          <w:b w:val="0"/>
+          <w:bCs w:val="0"/>
+          <w:i w:val="0"/>
+          <w:iCs w:val="0"/>
+          <w:smallCaps w:val="0"/>
+          <w:strike w:val="0"/>
+          <w:color w:val="000000"/>
+          <w:sz w:val="52"/>
+          <w:szCs w:val="52"/>
+          <w:u w:val="none"/>
+          <w:shd w:fill="auto" w:val="clear"/>
+          <w:vertAlign w:val="baseline"/>
+          <w:rtl w:val="0"/>
+        </w:rPr>
+        <w:t xml:space="preserve">observacoes</w:t>
+      </w:r>
+      <w:r>
+        <w:rPr>
+          <w:rtl w:val="0"/>
+        </w:rPr>
+      </w:r>
+    </w:p>
+    <w:p>
+      <w:pPr>
+        <w:spacing w:after="240" w:line="360" w:lineRule="auto"/>
+        <w:ind w:left="720" w:firstLine="0"/>
+        <w:jc w:val="both"/>
+        <w:rPr>
+          <w:rFonts w:ascii="Times New Roman" w:cs="Times New Roman" w:eastAsia="Times New Roman" w:hAnsi="Times New Roman"/>
+          <w:b w:val="1"/>
+          <w:bCs w:val="1"/>
+          <w:sz w:val="24"/>
+          <w:szCs w:val="24"/>
+        </w:rPr>
+      </w:pPr>
+      <w:r>
+        <w:rPr>
+          <w:rtl w:val="0"/>
+        </w:rPr>
+      </w:r>
+    </w:p>
+    <w:p>
+      <w:pPr>
+        <w:rPr>
+          <w:rFonts w:ascii="Times New Roman" w:cs="Times New Roman" w:eastAsia="Times New Roman" w:hAnsi="Times New Roman"/>
+          <w:b w:val="1"/>
+          <w:bCs w:val="1"/>
+          <w:sz w:val="24"/>
+          <w:szCs w:val="24"/>
+        </w:rPr>
+      </w:pPr>
+      <w:r>
+        <w:rPr>
+          <w:rFonts w:ascii="Times New Roman" w:cs="Times New Roman" w:eastAsia="Times New Roman" w:hAnsi="Times New Roman"/>
+          <w:b w:val="1"/>
+          <w:bCs w:val="1"/>
+          <w:sz w:val="24"/>
+          <w:szCs w:val="24"/>
+          <w:rtl w:val="0"/>
+        </w:rPr>
+        <w:t xml:space="preserve">Revistas alvo:</w:t>
+      </w:r>
+    </w:p>
+    <w:p>
+      <w:pPr>
+        <w:rPr>
+          <w:rFonts w:ascii="Times New Roman" w:cs="Times New Roman" w:eastAsia="Times New Roman" w:hAnsi="Times New Roman"/>
+          <w:b w:val="1"/>
+          <w:bCs w:val="1"/>
+          <w:sz w:val="24"/>
+          <w:szCs w:val="24"/>
+        </w:rPr>
+      </w:pPr>
+      <w:r>
+        <w:rPr>
+          <w:rtl w:val="0"/>
+        </w:rPr>
+      </w:r>
+    </w:p>
+    <w:p>
+      <w:pPr>
+        <w:rPr>
+          <w:rFonts w:ascii="Times New Roman" w:cs="Times New Roman" w:eastAsia="Times New Roman" w:hAnsi="Times New Roman"/>
+          <w:b w:val="1"/>
+          <w:bCs w:val="1"/>
+          <w:sz w:val="24"/>
+          <w:szCs w:val="24"/>
+        </w:rPr>
+      </w:pPr>
+      <w:r>
+        <w:rPr>
+          <w:rtl w:val="0"/>
+        </w:rPr>
+      </w:r>
+    </w:p>
+    <w:p>
+      <w:pPr>
+        <w:rPr>
+          <w:rFonts w:ascii="Times New Roman" w:cs="Times New Roman" w:eastAsia="Times New Roman" w:hAnsi="Times New Roman"/>
+          <w:sz w:val="24"/>
+          <w:szCs w:val="24"/>
+        </w:rPr>
+      </w:pPr>
+      <w:r>
+        <w:rPr>
+          <w:rFonts w:ascii="Times New Roman" w:cs="Times New Roman" w:eastAsia="Times New Roman" w:hAnsi="Times New Roman"/>
+          <w:sz w:val="24"/>
+          <w:szCs w:val="24"/>
+          <w:rtl w:val="0"/>
+        </w:rPr>
+        <w:t xml:space="preserve">ensaio - cesgranrio</w:t>
+      </w:r>
+    </w:p>
+    <w:p>
+      <w:pPr>
+        <w:rPr>
+          <w:rFonts w:ascii="Times New Roman" w:cs="Times New Roman" w:eastAsia="Times New Roman" w:hAnsi="Times New Roman"/>
+          <w:sz w:val="24"/>
+          <w:szCs w:val="24"/>
+        </w:rPr>
+      </w:pPr>
+      <w:r>
+        <w:rPr>
+          <w:rtl w:val="0"/>
+        </w:rPr>
+      </w:r>
+    </w:p>
+    <w:p>
+      <w:pPr>
+        <w:rPr>
+          <w:rFonts w:ascii="Times New Roman" w:cs="Times New Roman" w:eastAsia="Times New Roman" w:hAnsi="Times New Roman"/>
+          <w:sz w:val="24"/>
+          <w:szCs w:val="24"/>
+        </w:rPr>
+      </w:pPr>
+      <w:r>
+        <w:rPr>
+          <w:rFonts w:ascii="Times New Roman" w:cs="Times New Roman" w:eastAsia="Times New Roman" w:hAnsi="Times New Roman"/>
+          <w:sz w:val="24"/>
+          <w:szCs w:val="24"/>
+          <w:rtl w:val="0"/>
+        </w:rPr>
+        <w:t xml:space="preserve">SBIE</w:t>
+      </w:r>
+    </w:p>
+    <w:p>
+      <w:pPr>
+        <w:rPr>
+          <w:rFonts w:ascii="Times New Roman" w:cs="Times New Roman" w:eastAsia="Times New Roman" w:hAnsi="Times New Roman"/>
+          <w:sz w:val="24"/>
+          <w:szCs w:val="24"/>
+        </w:rPr>
+      </w:pPr>
+      <w:r>
+        <w:rPr>
+          <w:rtl w:val="0"/>
+        </w:rPr>
+      </w:r>
+    </w:p>
+    <w:p>
+      <w:pPr>
+        <w:rPr>
+          <w:rFonts w:ascii="Times New Roman" w:cs="Times New Roman" w:eastAsia="Times New Roman" w:hAnsi="Times New Roman"/>
+          <w:b w:val="1"/>
+          <w:bCs w:val="1"/>
+          <w:sz w:val="24"/>
+          <w:szCs w:val="24"/>
+        </w:rPr>
+      </w:pPr>
+      <w:r>
+        <w:rPr>
+          <w:rFonts w:ascii="Times New Roman" w:cs="Times New Roman" w:eastAsia="Times New Roman" w:hAnsi="Times New Roman"/>
+          <w:sz w:val="24"/>
+          <w:szCs w:val="24"/>
+          <w:rtl w:val="0"/>
+        </w:rPr>
+        <w:t xml:space="preserve">RAP</w:t>
+      </w:r>
+      <w:r>
+        <w:rPr>
+          <w:rtl w:val="0"/>
+        </w:rPr>
+      </w:r>
+    </w:p>
+    <w:p>
+      <w:pPr>
+        <w:spacing w:after="240" w:line="360" w:lineRule="auto"/>
+        <w:jc w:val="both"/>
+        <w:rPr>
+          <w:rFonts w:ascii="Times New Roman" w:cs="Times New Roman" w:eastAsia="Times New Roman" w:hAnsi="Times New Roman"/>
+          <w:b w:val="1"/>
+          <w:bCs w:val="1"/>
+          <w:sz w:val="24"/>
+          <w:szCs w:val="24"/>
+        </w:rPr>
+      </w:pPr>
+      <w:r>
+        <w:rPr>
+          <w:rtl w:val="0"/>
+        </w:rPr>
+      </w:r>
+    </w:p>
+    <w:p>
+      <w:pPr>
+        <w:spacing w:after="240" w:line="360" w:lineRule="auto"/>
+        <w:jc w:val="both"/>
+        <w:rPr>
+          <w:rFonts w:ascii="Times New Roman" w:cs="Times New Roman" w:eastAsia="Times New Roman" w:hAnsi="Times New Roman"/>
+          <w:b w:val="1"/>
+          <w:bCs w:val="1"/>
+          <w:sz w:val="24"/>
+          <w:szCs w:val="24"/>
+        </w:rPr>
+      </w:pPr>
+      <w:r>
+        <w:rPr>
+          <w:rFonts w:ascii="Times New Roman" w:cs="Times New Roman" w:eastAsia="Times New Roman" w:hAnsi="Times New Roman"/>
+          <w:b w:val="1"/>
+          <w:bCs w:val="1"/>
+          <w:sz w:val="24"/>
+          <w:szCs w:val="24"/>
+          <w:rtl w:val="0"/>
+        </w:rPr>
+        <w:t xml:space="preserve">Total de palavras:</w:t>
+      </w:r>
+    </w:p>
+    <w:p>
+      <w:pPr>
+        <w:numPr>
+          <w:ilvl w:val="0"/>
+          <w:numId w:val="1"/>
+        </w:numPr>
+        <w:spacing w:after="240" w:line="360" w:lineRule="auto"/>
+        <w:ind w:left="720" w:hanging="360"/>
+        <w:jc w:val="both"/>
+        <w:rPr>
+          <w:rFonts w:ascii="Times New Roman" w:cs="Times New Roman" w:eastAsia="Times New Roman" w:hAnsi="Times New Roman"/>
+          <w:b w:val="1"/>
+          <w:bCs w:val="1"/>
+          <w:sz w:val="24"/>
+          <w:szCs w:val="24"/>
+        </w:rPr>
+      </w:pPr>
+      <w:r>
+        <w:rPr>
+          <w:rFonts w:ascii="Times New Roman" w:cs="Times New Roman" w:eastAsia="Times New Roman" w:hAnsi="Times New Roman"/>
+          <w:b w:val="1"/>
+          <w:bCs w:val="1"/>
+          <w:sz w:val="24"/>
+          <w:szCs w:val="24"/>
+          <w:rtl w:val="0"/>
+        </w:rPr>
+        <w:t xml:space="preserve">7829 palavras literalmente, sem contar com cabecalhos e rodapes </w:t>
+      </w:r>
+    </w:p>
+    <w:p>
+      <w:pPr>
+        <w:rPr>
+          <w:rFonts w:ascii="Times New Roman" w:cs="Times New Roman" w:eastAsia="Times New Roman" w:hAnsi="Times New Roman"/>
+          <w:sz w:val="24"/>
+          <w:szCs w:val="24"/>
+        </w:rPr>
+      </w:pPr>
+      <w:r>
+        <w:rPr>
+          <w:rtl w:val="0"/>
+        </w:rPr>
+      </w:r>
+    </w:p>
     <w:sectPr>
       <w:type w:val="nextPage"/>
       <w:pgSz w:h="16834" w:w="11909" w:orient="portrait"/>
@@ -7963,7 +8273,121 @@
 </file>
 
 <file path=word/numbering.xml><?xml version="1.0" encoding="utf-8"?>
-<w:numbering xmlns:mc="http://schemas.openxmlformats.org/markup-compatibility/2006" xmlns:o="urn:schemas-microsoft-com:office:office" xmlns:r="http://schemas.openxmlformats.org/officeDocument/2006/relationships" xmlns:m="http://schemas.openxmlformats.org/officeDocument/2006/math" xmlns:v="urn:schemas-microsoft-com:vml" xmlns:wp="http://schemas.openxmlformats.org/drawingml/2006/wordprocessingDrawing" xmlns:w10="urn:schemas-microsoft-com:office:word" xmlns:w="http://schemas.openxmlformats.org/wordprocessingml/2006/main" xmlns:wne="http://schemas.microsoft.com/office/word/2006/wordml" xmlns:sl="http://schemas.openxmlformats.org/schemaLibrary/2006/main" xmlns:a="http://schemas.openxmlformats.org/drawingml/2006/main" xmlns:pic="http://schemas.openxmlformats.org/drawingml/2006/picture" xmlns:c="http://schemas.openxmlformats.org/drawingml/2006/chart" xmlns:lc="http://schemas.openxmlformats.org/drawingml/2006/lockedCanvas" xmlns:dgm="http://schemas.openxmlformats.org/drawingml/2006/diagram" xmlns:wps="http://schemas.microsoft.com/office/word/2010/wordprocessingShape" xmlns:wpg="http://schemas.microsoft.com/office/word/2010/wordprocessingGroup" xmlns:w14="http://schemas.microsoft.com/office/word/2010/wordml" xmlns:w15="http://schemas.microsoft.com/office/word/2012/wordml" xmlns:w16="http://schemas.microsoft.com/office/word/2018/wordml" xmlns:w16cex="http://schemas.microsoft.com/office/word/2018/wordml/cex" xmlns:w16cid="http://schemas.microsoft.com/office/word/2016/wordml/cid" xmlns="http://schemas.microsoft.com/office/tasks/2019/documenttasks" xmlns:cr="http://schemas.microsoft.com/office/comments/2020/reactions"/>
+<w:numbering xmlns:mc="http://schemas.openxmlformats.org/markup-compatibility/2006" xmlns:o="urn:schemas-microsoft-com:office:office" xmlns:r="http://schemas.openxmlformats.org/officeDocument/2006/relationships" xmlns:m="http://schemas.openxmlformats.org/officeDocument/2006/math" xmlns:v="urn:schemas-microsoft-com:vml" xmlns:wp="http://schemas.openxmlformats.org/drawingml/2006/wordprocessingDrawing" xmlns:w10="urn:schemas-microsoft-com:office:word" xmlns:w="http://schemas.openxmlformats.org/wordprocessingml/2006/main" xmlns:wne="http://schemas.microsoft.com/office/word/2006/wordml" xmlns:sl="http://schemas.openxmlformats.org/schemaLibrary/2006/main" xmlns:a="http://schemas.openxmlformats.org/drawingml/2006/main" xmlns:pic="http://schemas.openxmlformats.org/drawingml/2006/picture" xmlns:c="http://schemas.openxmlformats.org/drawingml/2006/chart" xmlns:lc="http://schemas.openxmlformats.org/drawingml/2006/lockedCanvas" xmlns:dgm="http://schemas.openxmlformats.org/drawingml/2006/diagram" xmlns:wps="http://schemas.microsoft.com/office/word/2010/wordprocessingShape" xmlns:wpg="http://schemas.microsoft.com/office/word/2010/wordprocessingGroup" xmlns:w14="http://schemas.microsoft.com/office/word/2010/wordml" xmlns:w15="http://schemas.microsoft.com/office/word/2012/wordml" xmlns:w16="http://schemas.microsoft.com/office/word/2018/wordml" xmlns:w16cex="http://schemas.microsoft.com/office/word/2018/wordml/cex" xmlns:w16cid="http://schemas.microsoft.com/office/word/2016/wordml/cid" xmlns="http://schemas.microsoft.com/office/tasks/2019/documenttasks" xmlns:cr="http://schemas.microsoft.com/office/comments/2020/reactions">
+  <w:abstractNum w:abstractNumId="1">
+    <w:lvl w:ilvl="0">
+      <w:start w:val="1"/>
+      <w:numFmt w:val="bullet"/>
+      <w:lvlText w:val="●"/>
+      <w:lvlJc w:val="left"/>
+      <w:pPr>
+        <w:ind w:left="720" w:hanging="360"/>
+      </w:pPr>
+      <w:rPr>
+        <w:u w:val="none"/>
+      </w:rPr>
+    </w:lvl>
+    <w:lvl w:ilvl="1">
+      <w:start w:val="1"/>
+      <w:numFmt w:val="bullet"/>
+      <w:lvlText w:val="○"/>
+      <w:lvlJc w:val="left"/>
+      <w:pPr>
+        <w:ind w:left="1440" w:hanging="360"/>
+      </w:pPr>
+      <w:rPr>
+        <w:u w:val="none"/>
+      </w:rPr>
+    </w:lvl>
+    <w:lvl w:ilvl="2">
+      <w:start w:val="1"/>
+      <w:numFmt w:val="bullet"/>
+      <w:lvlText w:val="■"/>
+      <w:lvlJc w:val="left"/>
+      <w:pPr>
+        <w:ind w:left="2160" w:hanging="360"/>
+      </w:pPr>
+      <w:rPr>
+        <w:u w:val="none"/>
+      </w:rPr>
+    </w:lvl>
+    <w:lvl w:ilvl="3">
+      <w:start w:val="1"/>
+      <w:numFmt w:val="bullet"/>
+      <w:lvlText w:val="●"/>
+      <w:lvlJc w:val="left"/>
+      <w:pPr>
+        <w:ind w:left="2880" w:hanging="360"/>
+      </w:pPr>
+      <w:rPr>
+        <w:u w:val="none"/>
+      </w:rPr>
+    </w:lvl>
+    <w:lvl w:ilvl="4">
+      <w:start w:val="1"/>
+      <w:numFmt w:val="bullet"/>
+      <w:lvlText w:val="○"/>
+      <w:lvlJc w:val="left"/>
+      <w:pPr>
+        <w:ind w:left="3600" w:hanging="360"/>
+      </w:pPr>
+      <w:rPr>
+        <w:u w:val="none"/>
+      </w:rPr>
+    </w:lvl>
+    <w:lvl w:ilvl="5">
+      <w:start w:val="1"/>
+      <w:numFmt w:val="bullet"/>
+      <w:lvlText w:val="■"/>
+      <w:lvlJc w:val="left"/>
+      <w:pPr>
+        <w:ind w:left="4320" w:hanging="360"/>
+      </w:pPr>
+      <w:rPr>
+        <w:u w:val="none"/>
+      </w:rPr>
+    </w:lvl>
+    <w:lvl w:ilvl="6">
+      <w:start w:val="1"/>
+      <w:numFmt w:val="bullet"/>
+      <w:lvlText w:val="●"/>
+      <w:lvlJc w:val="left"/>
+      <w:pPr>
+        <w:ind w:left="5040" w:hanging="360"/>
+      </w:pPr>
+      <w:rPr>
+        <w:u w:val="none"/>
+      </w:rPr>
+    </w:lvl>
+    <w:lvl w:ilvl="7">
+      <w:start w:val="1"/>
+      <w:numFmt w:val="bullet"/>
+      <w:lvlText w:val="○"/>
+      <w:lvlJc w:val="left"/>
+      <w:pPr>
+        <w:ind w:left="5760" w:hanging="360"/>
+      </w:pPr>
+      <w:rPr>
+        <w:u w:val="none"/>
+      </w:rPr>
+    </w:lvl>
+    <w:lvl w:ilvl="8">
+      <w:start w:val="1"/>
+      <w:numFmt w:val="bullet"/>
+      <w:lvlText w:val="■"/>
+      <w:lvlJc w:val="left"/>
+      <w:pPr>
+        <w:ind w:left="6480" w:hanging="360"/>
+      </w:pPr>
+      <w:rPr>
+        <w:u w:val="none"/>
+      </w:rPr>
+    </w:lvl>
+  </w:abstractNum>
+  <w:num w:numId="1">
+    <w:abstractNumId w:val="1"/>
+  </w:num>
+</w:numbering>
 </file>
 
 <file path=word/styles.xml><?xml version="1.0" encoding="utf-8"?>

</xml_diff>